<commit_message>
Docs: refresh Review 2 demo guide for current state (sign-in, live results)
Co-Authored-By: Claude Sonnet 5.5 <noreply@anthropic.com>
Claude-Session: https://claude.ai/code/session_01VtiD3sYzdwe2Z45NHChjBt
</commit_message>
<xml_diff>
--- a/docs/demo_guide.docx
+++ b/docs/demo_guide.docx
@@ -39,6 +39,93 @@
       </w:r>
       <w:r>
         <w:t xml:space="preserve"> did not report.</w:t>
+      </w:r>
+    </w:p>
+    <w:p>
+      <w:r/>
+      <w:r>
+        <w:rPr>
+          <w:b/>
+        </w:rPr>
+        <w:t>Current state of the project:</w:t>
+      </w:r>
+      <w:r>
+        <w:t xml:space="preserve"> the live Oracle checks have been run (19/19 integration tests and all 16 queries passed on Oracle 21c XE on 2026-10-22). The application now also has a sign-in page (added after Review 2), so for this demo you sign in once with a manager account and then follow the Review 2 steps below. Do not show </w:t>
+      </w:r>
+      <w:r>
+        <w:rPr>
+          <w:rFonts w:ascii="Consolas" w:hAnsi="Consolas"/>
+        </w:rPr>
+        <w:t>.env</w:t>
+      </w:r>
+      <w:r>
+        <w:t xml:space="preserve"> or type a password where it can be read.</w:t>
+      </w:r>
+    </w:p>
+    <w:p>
+      <w:r/>
+      <w:r>
+        <w:rPr>
+          <w:b/>
+        </w:rPr>
+        <w:t>10 minutes before:</w:t>
+      </w:r>
+      <w:r>
+        <w:t xml:space="preserve"> Oracle services running (</w:t>
+      </w:r>
+      <w:r>
+        <w:rPr>
+          <w:rFonts w:ascii="Consolas" w:hAnsi="Consolas"/>
+        </w:rPr>
+        <w:t>Get-Service Oracle*</w:t>
+      </w:r>
+      <w:r>
+        <w:t xml:space="preserve">), </w:t>
+      </w:r>
+      <w:r>
+        <w:rPr>
+          <w:rFonts w:ascii="Consolas" w:hAnsi="Consolas"/>
+        </w:rPr>
+        <w:t>git checkout main</w:t>
+      </w:r>
+      <w:r>
+        <w:t xml:space="preserve"> and </w:t>
+      </w:r>
+      <w:r>
+        <w:rPr>
+          <w:rFonts w:ascii="Consolas" w:hAnsi="Consolas"/>
+        </w:rPr>
+        <w:t>git pull</w:t>
+      </w:r>
+      <w:r>
+        <w:t xml:space="preserve">, nothing else on port 5000, a SQL*Plus window open as </w:t>
+      </w:r>
+      <w:r>
+        <w:rPr>
+          <w:rFonts w:ascii="Consolas" w:hAnsi="Consolas"/>
+        </w:rPr>
+        <w:t>appliance_app</w:t>
+      </w:r>
+      <w:r>
+        <w:t xml:space="preserve">, and </w:t>
+      </w:r>
+      <w:r>
+        <w:rPr>
+          <w:rFonts w:ascii="Consolas" w:hAnsi="Consolas"/>
+        </w:rPr>
+        <w:t>python -m services.database</w:t>
+      </w:r>
+      <w:r>
+        <w:t xml:space="preserve"> printing </w:t>
+      </w:r>
+      <w:r>
+        <w:rPr>
+          <w:rFonts w:ascii="Consolas" w:hAnsi="Consolas"/>
+        </w:rPr>
+        <w:t>OK</w:t>
+      </w:r>
+      <w:r>
+        <w:t>.</w:t>
       </w:r>
     </w:p>
     <w:p>
@@ -564,7 +651,7 @@
         <w:br/>
         <w:t>python -m services.database      # expect: OK: Connected as APPLIANCE_APP to service XEPDB1</w:t>
         <w:br/>
-        <w:t>python app.py                    # open http://127.0.0.1:5000</w:t>
+        <w:t>python app.py                    # open http://127.0.0.1:5000 and sign in with your manager account</w:t>
       </w:r>
     </w:p>
     <w:p>
@@ -732,7 +819,7 @@
         </w:rPr>
         <w:t>SELECT 'PRODUCTS' t, COUNT(*) FROM PRODUCTS UNION ALL SELECT 'SALES', COUNT(*) FROM SALES</w:t>
         <w:br/>
-        <w:t>UNION ALL SELECT 'SALE_ITEMS', COUNT(*) FROM SALE_ITEMS;   -- 14 / 8 / 15 on a fresh seed</w:t>
+        <w:t>UNION ALL SELECT 'SALE_ITEMS', COUNT(*) FROM SALE_ITEMS;   -- 14 / 8 / 15 on a fresh seed; your database may show more (e.g. 9 sales, 16 items) because of sales made in the app</w:t>
       </w:r>
     </w:p>
     <w:p>
@@ -746,7 +833,7 @@
         <w:t>seed.sql</w:t>
       </w:r>
       <w:r>
-        <w:t xml:space="preserve"> is re-runnable (MERGE).</w:t>
+        <w:t xml:space="preserve"> is re-runnable (MERGE): a second run reports 0 rows merged.</w:t>
       </w:r>
     </w:p>
     <w:p>
@@ -822,7 +909,16 @@
         <w:t>AU-EK18</w:t>
       </w:r>
       <w:r>
-        <w:t xml:space="preserve"> (never sold); Q10 returns Televisions, Air Conditioners and Washing Machines.</w:t>
+        <w:t xml:space="preserve"> (never sold); Q10 returns Televisions (139,996), Air Conditioners and Washing Machines (50,998). Air Conditioners shows 100,497 on a database that also holds the extra app sale INV-001000 (63,498 on a pure seed). For readable columns run </w:t>
+      </w:r>
+      <w:r>
+        <w:rPr>
+          <w:rFonts w:ascii="Consolas" w:hAnsi="Consolas"/>
+        </w:rPr>
+        <w:t>@database\queries.sql</w:t>
+      </w:r>
+      <w:r>
+        <w:t xml:space="preserve"> from SQL*Plus (it sets widths).</w:t>
       </w:r>
     </w:p>
     <w:p>
@@ -895,10 +991,10 @@
         <w:rPr>
           <w:rFonts w:ascii="Consolas" w:hAnsi="Consolas"/>
         </w:rPr>
-        <w:t>{"database":"ok", …}</w:t>
+        <w:t>{"app":"ok","database":"ok"}</w:t>
       </w:r>
       <w:r>
-        <w:t xml:space="preserve">. Show </w:t>
+        <w:t xml:space="preserve"> (status only; no database user or service name is exposed). Show </w:t>
       </w:r>
       <w:r>
         <w:rPr>
@@ -971,7 +1067,7 @@
         <w:pStyle w:val="ListBullet"/>
       </w:pPr>
       <w:r>
-        <w:t>New Sale: customer + employee, add Mixer ×2 and Window AC ×1 → Record sale. Invoice page shows DB prices and total.</w:t>
+        <w:t>New Sale: choose a customer, add Mixer ×2 and Window AC ×1 → Record sale. Invoice page shows DB prices and total, and "sold by" is the signed-in employee.</w:t>
       </w:r>
     </w:p>
     <w:p>
@@ -979,7 +1075,7 @@
         <w:pStyle w:val="ListBullet"/>
       </w:pPr>
       <w:r>
-        <w:t>Products page: stock now 23 and 1 (deducted once, in the service transaction — the trigger touches no inventory).</w:t>
+        <w:t>Products page: stock now 23 and 1 if they started at 25 and 2 (deducted once, in the service transaction — the trigger touches no inventory).</w:t>
       </w:r>
     </w:p>
     <w:p>
@@ -1064,19 +1160,10 @@
         <w:rPr>
           <w:rFonts w:ascii="Consolas" w:hAnsi="Consolas"/>
         </w:rPr>
-        <w:t>python -m pytest tests -v</w:t>
+        <w:t>python -m pytest tests -q</w:t>
       </w:r>
       <w:r>
-        <w:t xml:space="preserve"> → unit + route tests PASSED; live tests listed as BLOCKED if no test schema is configured. [LIVE ORACLE] With the test schema variables set (README §9): </w:t>
-      </w:r>
-      <w:r>
-        <w:rPr>
-          <w:rFonts w:ascii="Consolas" w:hAnsi="Consolas"/>
-        </w:rPr>
-        <w:t>python -m pytest tests\test_oracle_integration.py -v</w:t>
-      </w:r>
-      <w:r>
-        <w:t xml:space="preserve"> — includes the 8-thread overselling test (exactly 5 of 8 purchases succeed when stock is 5). Show the matrix in </w:t>
+        <w:t xml:space="preserve"> → 155 passed, 19 skipped (the 19 are live Oracle tests, skipped unless a test schema is configured). [LIVE ORACLE] The live suite passed 19/19 on Oracle 21c XE on 2026-10-22 (the first run was 18/19: a mistake in one test, not in the app, fixed). It includes the 8-thread overselling test (exactly 5 of 8 purchases succeed when stock is 5). To re-run it live you must create a separate test user first (README §9); do not do this during the demo. Show the matrix in </w:t>
       </w:r>
       <w:r>
         <w:rPr>
@@ -1085,7 +1172,7 @@
         <w:t>docs/Review_2_Report.md</w:t>
       </w:r>
       <w:r>
-        <w:t xml:space="preserve"> §24 — statuses are generated from the real result file.</w:t>
+        <w:t xml:space="preserve"> §24 (76 offline and 16 live Review 2 cases PASSED). The live rows are transcribed from your console output, and the report says so.</w:t>
       </w:r>
     </w:p>
     <w:p>
@@ -1198,10 +1285,10 @@
         <w:rPr>
           <w:b/>
         </w:rPr>
-        <w:t>Why no login?</w:t>
+        <w:t>Is there a login?</w:t>
       </w:r>
       <w:r>
-        <w:t xml:space="preserve"> Out of academic scope; documented limitation — run on localhost.</w:t>
+        <w:t xml:space="preserve"> Yes, added after Review 2: Manager and Cashier roles (see the Review 3 report). Review 2's scope is the database and backend, which this guide demonstrates.</w:t>
       </w:r>
     </w:p>
     <w:p>
@@ -1231,7 +1318,7 @@
         <w:t>What did you not verify?</w:t>
       </w:r>
       <w:r>
-        <w:t xml:space="preserve"> Whatever the testing matrix labels BLOCKED/NOT RUN; be explicit.</w:t>
+        <w:t xml:space="preserve"> Load testing, HTTPS and several-worker deployment, and a recorded browser walkthrough; the live database checks themselves were run (19/19 tests, 16/16 queries).</w:t>
       </w:r>
     </w:p>
     <w:sectPr>

</xml_diff>